<commit_message>
Completa as fontes do sermão de Romanos 3.21-28 e registra a entrega
Preenche os dados bibliográficos que estavam pendentes nas notas do
sermão (Thielman, Stott, Keller, Merida, Moo), acrescenta a história da
lista dos cinco solas à nota 4, confere Pv 17.15 numa segunda fonte e
registra a Fase 7 no estudo. O DOCX do sermão foi regenerado (12
páginas, 35 notas).

Co-Authored-By: Claude Opus 5.5 <noreply@anthropic.com>
</commit_message>
<xml_diff>
--- a/estudos/romanos/Reformados-pela-Palavra_Rm3-21-28.docx
+++ b/estudos/romanos/Reformados-pela-Palavra_Rm3-21-28.docx
@@ -3515,33 +3515,7 @@
           <w:sz w:val="18"/>
           <w:szCs w:val="18"/>
         </w:rPr>
-        <w:t xml:space="preserve">, v. 4, ed. Otto Clemen. 6. ed. Berlim: de Gruyter, 1967, p. 421-428. Disponível em: https://sourcebooks.web.fordham.edu/mod/1519luther-tower.asp. Acesso em: 24 out. 2026. [Conferir a edição das </w:t>
-      </w:r>
-      <w:r>
-        <w:rPr>
-          <w:rFonts w:ascii="Cambria" w:cs="Cambria" w:eastAsia="Cambria" w:hAnsi="Cambria"/>
-          <w:b w:val="false"/>
-          <w:bCs w:val="false"/>
-          <w:i/>
-          <w:iCs/>
-          <w:color w:val="2B2B33"/>
-          <w:sz w:val="18"/>
-          <w:szCs w:val="18"/>
-        </w:rPr>
-        <w:t xml:space="preserve">Obras Selecionadas</w:t>
-      </w:r>
-      <w:r>
-        <w:rPr>
-          <w:rFonts w:ascii="Cambria" w:cs="Cambria" w:eastAsia="Cambria" w:hAnsi="Cambria"/>
-          <w:b w:val="false"/>
-          <w:bCs w:val="false"/>
-          <w:i w:val="false"/>
-          <w:iCs w:val="false"/>
-          <w:color w:val="2B2B33"/>
-          <w:sz w:val="18"/>
-          <w:szCs w:val="18"/>
-        </w:rPr>
-        <w:t xml:space="preserve">.]</w:t>
+        <w:t xml:space="preserve">, v. 4, ed. Otto Clemen. 6. ed. Berlim: de Gruyter, 1967, p. 421-428. Disponível em: https://sourcebooks.web.fordham.edu/mod/1519luther-tower.asp. Acesso em: 24 out. 2026.</w:t>
       </w:r>
     </w:p>
   </w:footnote>
@@ -3671,7 +3645,33 @@
           <w:sz w:val="18"/>
           <w:szCs w:val="18"/>
         </w:rPr>
-        <w:t xml:space="preserve">. [São Paulo: Vida Nova, ano a conferir], p. 285.</w:t>
+        <w:t xml:space="preserve">, p. 285. Tradução brasileira de </w:t>
+      </w:r>
+      <w:r>
+        <w:rPr>
+          <w:rFonts w:ascii="Cambria" w:cs="Cambria" w:eastAsia="Cambria" w:hAnsi="Cambria"/>
+          <w:b w:val="false"/>
+          <w:bCs w:val="false"/>
+          <w:i/>
+          <w:iCs/>
+          <w:color w:val="2B2B33"/>
+          <w:sz w:val="18"/>
+          <w:szCs w:val="18"/>
+        </w:rPr>
+        <w:t xml:space="preserve">The Epistle to the Romans</w:t>
+      </w:r>
+      <w:r>
+        <w:rPr>
+          <w:rFonts w:ascii="Cambria" w:cs="Cambria" w:eastAsia="Cambria" w:hAnsi="Cambria"/>
+          <w:b w:val="false"/>
+          <w:bCs w:val="false"/>
+          <w:i w:val="false"/>
+          <w:iCs w:val="false"/>
+          <w:color w:val="2B2B33"/>
+          <w:sz w:val="18"/>
+          <w:szCs w:val="18"/>
+        </w:rPr>
+        <w:t xml:space="preserve">. 2. ed. Grand Rapids: Eerdmans, 2018 (NICNT) [editora e ano da tradução a conferir].</w:t>
       </w:r>
     </w:p>
   </w:footnote>
@@ -3710,7 +3710,163 @@
           <w:sz w:val="18"/>
           <w:szCs w:val="18"/>
         </w:rPr>
-        <w:t xml:space="preserve"> Os reformadores usavam as expressões, mas a lista dos "cinco solas" como conjunto fechado é uma organização posterior, difundida sobretudo no século XX. Tony Merida, comentando Rm 3.21-31, observa que o parágrafo contém os cinco, com o v. 27 na categoria </w:t>
+        <w:t xml:space="preserve"> Os reformadores usavam as expressões, mas nenhum deles as reuniu numa lista. O conjunto só se formou no século XX: em 1916, o luterano Theodore Engelder falou de três princípios (</w:t>
+      </w:r>
+      <w:r>
+        <w:rPr>
+          <w:rFonts w:ascii="Cambria" w:cs="Cambria" w:eastAsia="Cambria" w:hAnsi="Cambria"/>
+          <w:b w:val="false"/>
+          <w:bCs w:val="false"/>
+          <w:i/>
+          <w:iCs/>
+          <w:color w:val="2B2B33"/>
+          <w:sz w:val="18"/>
+          <w:szCs w:val="18"/>
+        </w:rPr>
+        <w:t xml:space="preserve">sola Scriptura</w:t>
+      </w:r>
+      <w:r>
+        <w:rPr>
+          <w:rFonts w:ascii="Cambria" w:cs="Cambria" w:eastAsia="Cambria" w:hAnsi="Cambria"/>
+          <w:b w:val="false"/>
+          <w:bCs w:val="false"/>
+          <w:i w:val="false"/>
+          <w:iCs w:val="false"/>
+          <w:color w:val="2B2B33"/>
+          <w:sz w:val="18"/>
+          <w:szCs w:val="18"/>
+        </w:rPr>
+        <w:t xml:space="preserve">, </w:t>
+      </w:r>
+      <w:r>
+        <w:rPr>
+          <w:rFonts w:ascii="Cambria" w:cs="Cambria" w:eastAsia="Cambria" w:hAnsi="Cambria"/>
+          <w:b w:val="false"/>
+          <w:bCs w:val="false"/>
+          <w:i/>
+          <w:iCs/>
+          <w:color w:val="2B2B33"/>
+          <w:sz w:val="18"/>
+          <w:szCs w:val="18"/>
+        </w:rPr>
+        <w:t xml:space="preserve">sola gratia</w:t>
+      </w:r>
+      <w:r>
+        <w:rPr>
+          <w:rFonts w:ascii="Cambria" w:cs="Cambria" w:eastAsia="Cambria" w:hAnsi="Cambria"/>
+          <w:b w:val="false"/>
+          <w:bCs w:val="false"/>
+          <w:i w:val="false"/>
+          <w:iCs w:val="false"/>
+          <w:color w:val="2B2B33"/>
+          <w:sz w:val="18"/>
+          <w:szCs w:val="18"/>
+        </w:rPr>
+        <w:t xml:space="preserve">, </w:t>
+      </w:r>
+      <w:r>
+        <w:rPr>
+          <w:rFonts w:ascii="Cambria" w:cs="Cambria" w:eastAsia="Cambria" w:hAnsi="Cambria"/>
+          <w:b w:val="false"/>
+          <w:bCs w:val="false"/>
+          <w:i/>
+          <w:iCs/>
+          <w:color w:val="2B2B33"/>
+          <w:sz w:val="18"/>
+          <w:szCs w:val="18"/>
+        </w:rPr>
+        <w:t xml:space="preserve">sola fide</w:t>
+      </w:r>
+      <w:r>
+        <w:rPr>
+          <w:rFonts w:ascii="Cambria" w:cs="Cambria" w:eastAsia="Cambria" w:hAnsi="Cambria"/>
+          <w:b w:val="false"/>
+          <w:bCs w:val="false"/>
+          <w:i w:val="false"/>
+          <w:iCs w:val="false"/>
+          <w:color w:val="2B2B33"/>
+          <w:sz w:val="18"/>
+          <w:szCs w:val="18"/>
+        </w:rPr>
+        <w:t xml:space="preserve">), e em 1934 Emil Brunner trocou </w:t>
+      </w:r>
+      <w:r>
+        <w:rPr>
+          <w:rFonts w:ascii="Cambria" w:cs="Cambria" w:eastAsia="Cambria" w:hAnsi="Cambria"/>
+          <w:b w:val="false"/>
+          <w:bCs w:val="false"/>
+          <w:i/>
+          <w:iCs/>
+          <w:color w:val="2B2B33"/>
+          <w:sz w:val="18"/>
+          <w:szCs w:val="18"/>
+        </w:rPr>
+        <w:t xml:space="preserve">sola Scriptura</w:t>
+      </w:r>
+      <w:r>
+        <w:rPr>
+          <w:rFonts w:ascii="Cambria" w:cs="Cambria" w:eastAsia="Cambria" w:hAnsi="Cambria"/>
+          <w:b w:val="false"/>
+          <w:bCs w:val="false"/>
+          <w:i w:val="false"/>
+          <w:iCs w:val="false"/>
+          <w:color w:val="2B2B33"/>
+          <w:sz w:val="18"/>
+          <w:szCs w:val="18"/>
+        </w:rPr>
+        <w:t xml:space="preserve"> por </w:t>
+      </w:r>
+      <w:r>
+        <w:rPr>
+          <w:rFonts w:ascii="Cambria" w:cs="Cambria" w:eastAsia="Cambria" w:hAnsi="Cambria"/>
+          <w:b w:val="false"/>
+          <w:bCs w:val="false"/>
+          <w:i/>
+          <w:iCs/>
+          <w:color w:val="2B2B33"/>
+          <w:sz w:val="18"/>
+          <w:szCs w:val="18"/>
+        </w:rPr>
+        <w:t xml:space="preserve">soli Deo gloria</w:t>
+      </w:r>
+      <w:r>
+        <w:rPr>
+          <w:rFonts w:ascii="Cambria" w:cs="Cambria" w:eastAsia="Cambria" w:hAnsi="Cambria"/>
+          <w:b w:val="false"/>
+          <w:bCs w:val="false"/>
+          <w:i w:val="false"/>
+          <w:iCs w:val="false"/>
+          <w:color w:val="2B2B33"/>
+          <w:sz w:val="18"/>
+          <w:szCs w:val="18"/>
+        </w:rPr>
+        <w:t xml:space="preserve"> (FIVE SOLAE. </w:t>
+      </w:r>
+      <w:r>
+        <w:rPr>
+          <w:rFonts w:ascii="Cambria" w:cs="Cambria" w:eastAsia="Cambria" w:hAnsi="Cambria"/>
+          <w:b w:val="false"/>
+          <w:bCs w:val="false"/>
+          <w:i/>
+          <w:iCs/>
+          <w:color w:val="2B2B33"/>
+          <w:sz w:val="18"/>
+          <w:szCs w:val="18"/>
+        </w:rPr>
+        <w:t xml:space="preserve">Wikipedia</w:t>
+      </w:r>
+      <w:r>
+        <w:rPr>
+          <w:rFonts w:ascii="Cambria" w:cs="Cambria" w:eastAsia="Cambria" w:hAnsi="Cambria"/>
+          <w:b w:val="false"/>
+          <w:bCs w:val="false"/>
+          <w:i w:val="false"/>
+          <w:iCs w:val="false"/>
+          <w:color w:val="2B2B33"/>
+          <w:sz w:val="18"/>
+          <w:szCs w:val="18"/>
+        </w:rPr>
+        <w:t xml:space="preserve">. Disponível em: https://en.wikipedia.org/wiki/Five_solae. Acesso em: 24 out. 2026). Tony Merida, comentando Rm 3.21-31, observa que o parágrafo contém os cinco, com o v. 27 na categoria </w:t>
       </w:r>
       <w:r>
         <w:rPr>
@@ -3749,20 +3905,20 @@
           <w:sz w:val="18"/>
           <w:szCs w:val="18"/>
         </w:rPr>
-        <w:t xml:space="preserve">Exaltando Jesus em Romanos</w:t>
-      </w:r>
-      <w:r>
-        <w:rPr>
-          <w:rFonts w:ascii="Cambria" w:cs="Cambria" w:eastAsia="Cambria" w:hAnsi="Cambria"/>
-          <w:b w:val="false"/>
-          <w:bCs w:val="false"/>
-          <w:i w:val="false"/>
-          <w:iCs w:val="false"/>
-          <w:color w:val="2B2B33"/>
-          <w:sz w:val="18"/>
-          <w:szCs w:val="18"/>
-        </w:rPr>
-        <w:t xml:space="preserve"> [editora e ano a conferir], sobre 3.21-31).</w:t>
+        <w:t xml:space="preserve">Exalting Jesus in Romans</w:t>
+      </w:r>
+      <w:r>
+        <w:rPr>
+          <w:rFonts w:ascii="Cambria" w:cs="Cambria" w:eastAsia="Cambria" w:hAnsi="Cambria"/>
+          <w:b w:val="false"/>
+          <w:bCs w:val="false"/>
+          <w:i w:val="false"/>
+          <w:iCs w:val="false"/>
+          <w:color w:val="2B2B33"/>
+          <w:sz w:val="18"/>
+          <w:szCs w:val="18"/>
+        </w:rPr>
+        <w:t xml:space="preserve">. Nashville: B&amp;H, 2021. (Christ-Centered Exposition Commentary), sobre 3.21-31; consultado em tradução portuguesa).</w:t>
       </w:r>
     </w:p>
   </w:footnote>
@@ -3957,7 +4113,7 @@
           <w:sz w:val="18"/>
           <w:szCs w:val="18"/>
         </w:rPr>
-        <w:t xml:space="preserve"> (1646), cap. I, § 10. [Conferir a tradução usada pela IPB.]</w:t>
+        <w:t xml:space="preserve"> (1646), cap. I, § 10.</w:t>
       </w:r>
     </w:p>
   </w:footnote>
@@ -4308,7 +4464,7 @@
           <w:sz w:val="18"/>
           <w:szCs w:val="18"/>
         </w:rPr>
-        <w:t xml:space="preserve">: introdução e comentário. [São Paulo: Vida Nova, ano a conferir], p. 52.</w:t>
+        <w:t xml:space="preserve">: introdução e comentário. São Paulo: Vida Nova [ano a conferir; catálogo de livreiro indica 1979], p. 52.</w:t>
       </w:r>
     </w:p>
   </w:footnote>
@@ -4360,7 +4516,7 @@
           <w:sz w:val="18"/>
           <w:szCs w:val="18"/>
         </w:rPr>
-        <w:t xml:space="preserve">Exaltando Jesus em Romanos</w:t>
+        <w:t xml:space="preserve">Exalting Jesus in Romans</w:t>
       </w:r>
       <w:r>
         <w:rPr>
@@ -4724,7 +4880,7 @@
           <w:sz w:val="18"/>
           <w:szCs w:val="18"/>
         </w:rPr>
-        <w:t xml:space="preserve">. Grand Rapids: Zondervan [ano a conferir]. (Zondervan Exegetical Commentary on the New Testament), excurso "Jesus as the Biblical 'Mercy Seat'", sobre Rm 3.25: inscrição num altar em Metrópolis, perto de Éfeso (fim do séc. I a.C.), "De César, instrumento de reconciliação".</w:t>
+        <w:t xml:space="preserve">. Grand Rapids: Zondervan, 2018. (Zondervan Exegetical Commentary on the New Testament), excurso "Jesus as the Biblical 'Mercy Seat'", sobre Rm 3.25: inscrição num altar em Metrópolis, perto de Éfeso (fim do séc. I a.C.), "De César, instrumento de reconciliação".</w:t>
       </w:r>
     </w:p>
   </w:footnote>
@@ -4789,7 +4945,7 @@
           <w:sz w:val="18"/>
           <w:szCs w:val="18"/>
         </w:rPr>
-        <w:t xml:space="preserve">. [Editora e ano a conferir], cap. 6, "A autossubstituição de Deus". Original: </w:t>
+        <w:t xml:space="preserve">. Tradução de João Batista. São Paulo: Vida, 2006, cap. 6, "A autossubstituição de Deus". Original: </w:t>
       </w:r>
       <w:r>
         <w:rPr>
@@ -5062,7 +5218,7 @@
           <w:sz w:val="18"/>
           <w:szCs w:val="18"/>
         </w:rPr>
-        <w:t xml:space="preserve"> (1559), III.11.7. Paráfrase a partir da tradução inglesa disponível em: https://ccel.org/ccel/calvin/institutes.v.xii.html. Acesso em: 24 out. 2026. [Conferir edição e página em português.]</w:t>
+        <w:t xml:space="preserve"> (1559), III.11.7. Paráfrase a partir da tradução inglesa disponível em: https://ccel.org/ccel/calvin/institutes.v.xii.html. Acesso em: 24 out. 2026.</w:t>
       </w:r>
     </w:p>
   </w:footnote>
@@ -5231,7 +5387,7 @@
           <w:sz w:val="18"/>
           <w:szCs w:val="18"/>
         </w:rPr>
-        <w:t xml:space="preserve">: capítulos 1-7. [São Paulo: Vida Nova, ano a conferir], p. 89-90.</w:t>
+        <w:t xml:space="preserve">: capítulos 1-7. São Paulo: Vida Nova [ano a conferir], p. 89-90.</w:t>
       </w:r>
     </w:p>
   </w:footnote>
@@ -5608,7 +5764,7 @@
           <w:sz w:val="18"/>
           <w:szCs w:val="18"/>
         </w:rPr>
-        <w:t xml:space="preserve"> (1647), pergunta 1. [Conferir a tradução usada pela IPB.]</w:t>
+        <w:t xml:space="preserve"> (1647), pergunta 1.</w:t>
       </w:r>
     </w:p>
   </w:footnote>
@@ -5673,7 +5829,7 @@
           <w:sz w:val="18"/>
           <w:szCs w:val="18"/>
         </w:rPr>
-        <w:t xml:space="preserve">. [Editora e ano a conferir]. Original: </w:t>
+        <w:t xml:space="preserve">. São Paulo: Vida Nova, 2014. Original: </w:t>
       </w:r>
       <w:r>
         <w:rPr>

</xml_diff>